<commit_message>
612 - TESTING AND TAKING SCREENSHOTS
</commit_message>
<xml_diff>
--- a/2026-T1/T1B2-ICTNWK612-Plan-manage-troubleshooting-advance/2-tasks/Test-Report.docx
+++ b/2026-T1/T1B2-ICTNWK612-Plan-manage-troubleshooting-advance/2-tasks/Test-Report.docx
@@ -34,6 +34,102 @@
     </w:p>
     <w:p>
       <w:pPr>
+        <w:pStyle w:val="Subtitle"/>
+        <w:rPr>
+          <w:rFonts w:ascii="Arial" w:hAnsi="Arial" w:cs="Arial"/>
+        </w:rPr>
+      </w:pPr>
+      <w:r>
+        <w:rPr>
+          <w:rFonts w:ascii="Arial" w:hAnsi="Arial" w:cs="Arial"/>
+        </w:rPr>
+        <w:t>My RTO Network Diagram</w:t>
+      </w:r>
+      <w:r>
+        <w:rPr>
+          <w:rFonts w:ascii="Arial" w:hAnsi="Arial" w:cs="Arial"/>
+        </w:rPr>
+        <w:br/>
+      </w:r>
+      <w:r>
+        <w:rPr>
+          <w:rFonts w:ascii="Arial" w:hAnsi="Arial" w:cs="Arial"/>
+        </w:rPr>
+        <w:br/>
+      </w:r>
+      <w:r>
+        <w:rPr>
+          <w:rFonts w:ascii="Arial" w:hAnsi="Arial" w:cs="Arial"/>
+          <w:noProof/>
+        </w:rPr>
+        <w:drawing>
+          <wp:inline distT="0" distB="0" distL="0" distR="0" wp14:anchorId="3BABB86E" wp14:editId="45CF3511">
+            <wp:extent cx="5727700" cy="3372485"/>
+            <wp:effectExtent l="0" t="0" r="0" b="5715"/>
+            <wp:docPr id="480678182" name="Picture 1"/>
+            <wp:cNvGraphicFramePr>
+              <a:graphicFrameLocks xmlns:a="http://schemas.openxmlformats.org/drawingml/2006/main" noChangeAspect="1"/>
+            </wp:cNvGraphicFramePr>
+            <a:graphic xmlns:a="http://schemas.openxmlformats.org/drawingml/2006/main">
+              <a:graphicData uri="http://schemas.openxmlformats.org/drawingml/2006/picture">
+                <pic:pic xmlns:pic="http://schemas.openxmlformats.org/drawingml/2006/picture">
+                  <pic:nvPicPr>
+                    <pic:cNvPr id="480678182" name=""/>
+                    <pic:cNvPicPr/>
+                  </pic:nvPicPr>
+                  <pic:blipFill>
+                    <a:blip r:embed="rId8"/>
+                    <a:stretch>
+                      <a:fillRect/>
+                    </a:stretch>
+                  </pic:blipFill>
+                  <pic:spPr>
+                    <a:xfrm>
+                      <a:off x="0" y="0"/>
+                      <a:ext cx="5727700" cy="3372485"/>
+                    </a:xfrm>
+                    <a:prstGeom prst="rect">
+                      <a:avLst/>
+                    </a:prstGeom>
+                  </pic:spPr>
+                </pic:pic>
+              </a:graphicData>
+            </a:graphic>
+          </wp:inline>
+        </w:drawing>
+      </w:r>
+    </w:p>
+    <w:p>
+      <w:pPr>
+        <w:jc w:val="both"/>
+        <w:rPr>
+          <w:rFonts w:eastAsia="Arial"/>
+          <w:b/>
+          <w:color w:val="000000"/>
+          <w:szCs w:val="20"/>
+        </w:rPr>
+      </w:pPr>
+      <w:r>
+        <w:rPr>
+          <w:rFonts w:eastAsia="Arial"/>
+          <w:b/>
+          <w:color w:val="000000"/>
+          <w:szCs w:val="20"/>
+        </w:rPr>
+        <w:t>The network is based on the original design given in class, my design differs in the position of the multilayer switches and in the names of the PCs.</w:t>
+      </w:r>
+      <w:r>
+        <w:rPr>
+          <w:rFonts w:eastAsia="Arial"/>
+          <w:b/>
+          <w:color w:val="000000"/>
+          <w:szCs w:val="20"/>
+        </w:rPr>
+        <w:br w:type="page"/>
+      </w:r>
+    </w:p>
+    <w:p>
+      <w:pPr>
         <w:pBdr>
           <w:top w:val="nil"/>
           <w:left w:val="nil"/>
@@ -58,6 +154,7 @@
           <w:sz w:val="24"/>
           <w:szCs w:val="24"/>
         </w:rPr>
+        <w:lastRenderedPageBreak/>
         <w:t xml:space="preserve">Isolation of sub-optimal internetwork operations </w:t>
       </w:r>
     </w:p>
@@ -465,9 +562,9 @@
       </w:pPr>
     </w:p>
     <w:sectPr>
-      <w:headerReference w:type="default" r:id="rId8"/>
-      <w:footerReference w:type="even" r:id="rId9"/>
-      <w:footerReference w:type="default" r:id="rId10"/>
+      <w:headerReference w:type="default" r:id="rId9"/>
+      <w:footerReference w:type="even" r:id="rId10"/>
+      <w:footerReference w:type="default" r:id="rId11"/>
       <w:pgSz w:w="11900" w:h="16840"/>
       <w:pgMar w:top="1361" w:right="1247" w:bottom="1247" w:left="1247" w:header="708" w:footer="708" w:gutter="0"/>
       <w:pgNumType w:start="1"/>

</xml_diff>